<commit_message>
Design & technical document: final findings, billing schemes, manager-page notices
Co-Authored-By: Claude Opus 5.5 <noreply@anthropic.com>
Claude-Session: https://claude.ai/code/session_01GRjY5CQy6tbjzk2c5ZdYgZ
</commit_message>
<xml_diff>
--- a/docs/design-tech/HRX-Design-and-Technical-Document.docx
+++ b/docs/design-tech/HRX-Design-and-Technical-Document.docx
@@ -560,7 +560,7 @@
                 <w:color w:val="1888BC"/>
                 <w:sz w:val="16"/>
               </w:rPr>
-              <w:t>395ffca</w:t>
+              <w:t>24c7b51</w:t>
             </w:r>
           </w:p>
           <w:p>
@@ -2644,6 +2644,20 @@
         <w:spacing w:after="40"/>
       </w:pPr>
     </w:p>
+    <w:p>
+      <w:pPr>
+        <w:spacing w:after="120"/>
+      </w:pPr>
+      <w:r>
+        <w:rPr>
+          <w:rFonts w:ascii="Raleway" w:hAnsi="Raleway" w:eastAsia="Raleway"/>
+          <w:b w:val="0"/>
+          <w:color w:val="33343A"/>
+          <w:sz w:val="20"/>
+        </w:rPr>
+        <w:t>The rail shows the Admin only pages to managers only, and each of those pages shows an employee who opens its link directly the notice "This area is only available to managers and administrators" instead of its contents.</w:t>
+      </w:r>
+    </w:p>
     <w:tbl>
       <w:tblPr>
         <w:tblLook w:firstColumn="1" w:firstRow="1" w:lastColumn="0" w:lastRow="0" w:noHBand="0" w:noVBand="1" w:val="04A0"/>
@@ -4020,7 +4034,7 @@
                 <w:color w:val="33343A"/>
                 <w:sz w:val="17"/>
               </w:rPr>
-              <w:t>Search, filter, Add project. Detail tabs: Info (type, dates, PO, booking open, areas), Resourcing (assign, edit, release a resource with billing scheme, day rate, billable days, start date, areas), Contacts (the client's primary and secondary contact), Attachments.</w:t>
+              <w:t>Search, filter, Add project. Detail tabs: Info (type, dates, PO, booking open, areas), Resourcing (assign, edit, release a resource with a billing scheme by office — UK office, India office, Internal billing or a custom rate — day rate, billable days, start date, areas), Client team (the client's primary and secondary contact), Attachments.</w:t>
             </w:r>
           </w:p>
         </w:tc>
@@ -14610,7 +14624,43 @@
           <w:color w:val="33343A"/>
           <w:sz w:val="20"/>
         </w:rPr>
-        <w:t>. Issues with a fix waiting are marked with its branch.</w:t>
+        <w:t xml:space="preserve">. Issues with a fix waiting are marked with its branch; the branches are on the fork davida012/HRXService, each from </w:t>
+      </w:r>
+      <w:r>
+        <w:rPr>
+          <w:rFonts w:ascii="Raleway" w:hAnsi="Raleway" w:eastAsia="Raleway"/>
+          <w:b w:val="0"/>
+          <w:color w:val="1888BC"/>
+          <w:sz w:val="19"/>
+        </w:rPr>
+        <w:t>dev</w:t>
+      </w:r>
+      <w:r>
+        <w:rPr>
+          <w:rFonts w:ascii="Raleway" w:hAnsi="Raleway" w:eastAsia="Raleway"/>
+          <w:b w:val="0"/>
+          <w:color w:val="33343A"/>
+          <w:sz w:val="20"/>
+        </w:rPr>
+        <w:t xml:space="preserve">, for a pull request into bluestonex-labs/HRXService </w:t>
+      </w:r>
+      <w:r>
+        <w:rPr>
+          <w:rFonts w:ascii="Raleway" w:hAnsi="Raleway" w:eastAsia="Raleway"/>
+          <w:b w:val="0"/>
+          <w:color w:val="1888BC"/>
+          <w:sz w:val="19"/>
+        </w:rPr>
+        <w:t>dev</w:t>
+      </w:r>
+      <w:r>
+        <w:rPr>
+          <w:rFonts w:ascii="Raleway" w:hAnsi="Raleway" w:eastAsia="Raleway"/>
+          <w:b w:val="0"/>
+          <w:color w:val="33343A"/>
+          <w:sz w:val="20"/>
+        </w:rPr>
+        <w:t>.</w:t>
       </w:r>
     </w:p>
     <w:tbl>
@@ -15382,6 +15432,88 @@
                 <w:sz w:val="17"/>
               </w:rPr>
               <w:t>Open</w:t>
+            </w:r>
+          </w:p>
+        </w:tc>
+      </w:tr>
+      <w:tr>
+        <w:tc>
+          <w:tcPr>
+            <w:tcW w:type="dxa" w:w="454"/>
+          </w:tcPr>
+          <w:p>
+            <w:pPr>
+              <w:spacing w:after="0" w:line="264" w:lineRule="auto"/>
+            </w:pPr>
+            <w:r/>
+            <w:r>
+              <w:rPr>
+                <w:rFonts w:ascii="Raleway" w:hAnsi="Raleway" w:eastAsia="Raleway"/>
+                <w:b w:val="0"/>
+                <w:color w:val="33343A"/>
+                <w:sz w:val="17"/>
+              </w:rPr>
+              <w:t>I9</w:t>
+            </w:r>
+          </w:p>
+        </w:tc>
+        <w:tc>
+          <w:tcPr>
+            <w:tcW w:type="dxa" w:w="3402"/>
+          </w:tcPr>
+          <w:p>
+            <w:pPr>
+              <w:spacing w:after="0" w:line="264" w:lineRule="auto"/>
+            </w:pPr>
+            <w:r/>
+            <w:r>
+              <w:rPr>
+                <w:rFonts w:ascii="Raleway" w:hAnsi="Raleway" w:eastAsia="Raleway"/>
+                <w:b w:val="0"/>
+                <w:color w:val="33343A"/>
+                <w:sz w:val="17"/>
+              </w:rPr>
+              <w:t>Assign resource offers billing schemes by office and matches each to a BillingScheme record by name (model/BillingSchemes.js)</w:t>
+            </w:r>
+          </w:p>
+        </w:tc>
+        <w:tc>
+          <w:tcPr>
+            <w:tcW w:type="dxa" w:w="3288"/>
+          </w:tcPr>
+          <w:p>
+            <w:pPr>
+              <w:spacing w:after="0" w:line="264" w:lineRule="auto"/>
+            </w:pPr>
+            <w:r/>
+            <w:r>
+              <w:rPr>
+                <w:rFonts w:ascii="Raleway" w:hAnsi="Raleway" w:eastAsia="Raleway"/>
+                <w:b w:val="0"/>
+                <w:color w:val="33343A"/>
+                <w:sz w:val="17"/>
+              </w:rPr>
+              <w:t>Without records whose names contain "UK", "India", "Internal" and "Custom", that choice cannot be saved (the dialog says so)</w:t>
+            </w:r>
+          </w:p>
+        </w:tc>
+        <w:tc>
+          <w:tcPr>
+            <w:tcW w:type="dxa" w:w="2268"/>
+          </w:tcPr>
+          <w:p>
+            <w:pPr>
+              <w:spacing w:after="0" w:line="264" w:lineRule="auto"/>
+            </w:pPr>
+            <w:r/>
+            <w:r>
+              <w:rPr>
+                <w:rFonts w:ascii="Raleway" w:hAnsi="Raleway" w:eastAsia="Raleway"/>
+                <w:b w:val="0"/>
+                <w:color w:val="33343A"/>
+                <w:sz w:val="17"/>
+              </w:rPr>
+              <w:t>Check the BillingScheme records in the TDD service</w:t>
             </w:r>
           </w:p>
         </w:tc>
@@ -16333,6 +16465,8 @@
     <w:pPr>
       <w:pStyle w:val="Footer"/>
       <w:tabs>
+        <w:tab w:pos="4680" w:val="clear"/>
+        <w:tab w:pos="9360" w:val="clear"/>
         <w:tab w:pos="9411" w:val="right"/>
       </w:tabs>
     </w:pPr>
@@ -16444,6 +16578,8 @@
     <w:pPr>
       <w:pStyle w:val="Header"/>
       <w:tabs>
+        <w:tab w:pos="4680" w:val="clear"/>
+        <w:tab w:pos="9360" w:val="clear"/>
         <w:tab w:pos="9411" w:val="right"/>
       </w:tabs>
     </w:pPr>

</xml_diff>